<commit_message>
poprawki do planu exp
</commit_message>
<xml_diff>
--- a/PLAN EKSPERYMENTÓW.docx
+++ b/PLAN EKSPERYMENTÓW.docx
@@ -4,7 +4,7 @@
   <w:body>
     <w:p>
       <w:pPr>
-        <w:pStyle w:val="Tytu"/>
+        <w:pStyle w:val="Title"/>
         <w:jc w:val="both"/>
       </w:pPr>
       <w:r>
@@ -13,7 +13,7 @@
     </w:p>
     <w:p>
       <w:pPr>
-        <w:pStyle w:val="Akapitzlist"/>
+        <w:pStyle w:val="ListParagraph"/>
         <w:numPr>
           <w:ilvl w:val="0"/>
           <w:numId w:val="1"/>
@@ -49,31 +49,7 @@
         <w:t>PRZEBIEG</w:t>
       </w:r>
       <w:r>
-        <w:t xml:space="preserve"> W eksperymencie zostaną przetestowane wybrane modele klasyfikacyjne: </w:t>
-      </w:r>
-      <w:proofErr w:type="spellStart"/>
-      <w:r>
-        <w:t>Random</w:t>
-      </w:r>
-      <w:proofErr w:type="spellEnd"/>
-      <w:r>
-        <w:t xml:space="preserve"> </w:t>
-      </w:r>
-      <w:proofErr w:type="spellStart"/>
-      <w:r>
-        <w:t>Forest</w:t>
-      </w:r>
-      <w:proofErr w:type="spellEnd"/>
-      <w:r>
-        <w:t xml:space="preserve">, SVM, </w:t>
-      </w:r>
-      <w:proofErr w:type="spellStart"/>
-      <w:r>
-        <w:t>kNN</w:t>
-      </w:r>
-      <w:proofErr w:type="spellEnd"/>
-      <w:r>
-        <w:t>, drzewo decyzyjne</w:t>
+        <w:t xml:space="preserve"> W eksperymencie zostaną przetestowane wybrane modele klasyfikacyjne: Random Forest, SVM, kNN, drzewo decyzyjne</w:t>
       </w:r>
       <w:r>
         <w:t xml:space="preserve"> oraz</w:t>
@@ -82,15 +58,7 @@
         <w:t xml:space="preserve"> GNB. Skuteczność modeli zostanie oszacowana za pomocą 5-krotnej walidacji krzyżowej</w:t>
       </w:r>
       <w:r>
-        <w:t xml:space="preserve">. Do ostatecznego porównania zostanie obliczone: </w:t>
-      </w:r>
-      <w:proofErr w:type="spellStart"/>
-      <w:r>
-        <w:t>accuracy</w:t>
-      </w:r>
-      <w:proofErr w:type="spellEnd"/>
-      <w:r>
-        <w:t>, średnia wartości F1-score (macro) wraz z odchyleniem standardowym.</w:t>
+        <w:t>. Do ostatecznego porównania zostanie obliczone: accuracy, średnia wartości F1-score (macro) wraz z odchyleniem standardowym.</w:t>
       </w:r>
       <w:r>
         <w:t xml:space="preserve"> </w:t>
@@ -101,7 +69,7 @@
     </w:p>
     <w:p>
       <w:pPr>
-        <w:pStyle w:val="Akapitzlist"/>
+        <w:pStyle w:val="ListParagraph"/>
         <w:numPr>
           <w:ilvl w:val="0"/>
           <w:numId w:val="1"/>
@@ -143,31 +111,7 @@
         <w:t xml:space="preserve"> </w:t>
       </w:r>
       <w:r>
-        <w:t>W tym celu wykorzystana zostanie metoda wartości SHAP (</w:t>
-      </w:r>
-      <w:proofErr w:type="spellStart"/>
-      <w:r>
-        <w:t>Shapley</w:t>
-      </w:r>
-      <w:proofErr w:type="spellEnd"/>
-      <w:r>
-        <w:t xml:space="preserve"> </w:t>
-      </w:r>
-      <w:proofErr w:type="spellStart"/>
-      <w:r>
-        <w:t>Additive</w:t>
-      </w:r>
-      <w:proofErr w:type="spellEnd"/>
-      <w:r>
-        <w:t xml:space="preserve"> </w:t>
-      </w:r>
-      <w:proofErr w:type="spellStart"/>
-      <w:r>
-        <w:t>exPlanations</w:t>
-      </w:r>
-      <w:proofErr w:type="spellEnd"/>
-      <w:r>
-        <w:t>), co pozwoli na precyzyjne określenie kierunku i siły wpływu każdego komponentu chemicznego na ostateczną predykcję modelu.</w:t>
+        <w:t>W tym celu wykorzystana zostanie metoda wartości SHAP (Shapley Additive exPlanations), co pozwoli na precyzyjne określenie kierunku i siły wpływu każdego komponentu chemicznego na ostateczną predykcję modelu.</w:t>
       </w:r>
       <w:r>
         <w:t xml:space="preserve"> </w:t>
@@ -184,7 +128,7 @@
     </w:p>
     <w:p>
       <w:pPr>
-        <w:pStyle w:val="Akapitzlist"/>
+        <w:pStyle w:val="ListParagraph"/>
         <w:numPr>
           <w:ilvl w:val="0"/>
           <w:numId w:val="1"/>
@@ -258,7 +202,7 @@
     </w:p>
     <w:p>
       <w:pPr>
-        <w:pStyle w:val="Akapitzlist"/>
+        <w:pStyle w:val="ListParagraph"/>
         <w:numPr>
           <w:ilvl w:val="0"/>
           <w:numId w:val="1"/>
@@ -312,19 +256,16 @@
         <w:t xml:space="preserve">. Na obu podzbiorach zostaną wytrenowane próbki </w:t>
       </w:r>
       <w:r>
-        <w:t xml:space="preserve">na </w:t>
+        <w:t>na modelu</w:t>
+      </w:r>
+      <w:r>
+        <w:t xml:space="preserve"> wskazanym w</w:t>
+      </w:r>
+      <w:r>
+        <w:t xml:space="preserve"> </w:t>
       </w:r>
       <w:r>
         <w:lastRenderedPageBreak/>
-        <w:t>modelu</w:t>
-      </w:r>
-      <w:r>
-        <w:t xml:space="preserve"> wskazanym w</w:t>
-      </w:r>
-      <w:r>
-        <w:t xml:space="preserve"> </w:t>
-      </w:r>
-      <w:r>
         <w:t>eksperymencie</w:t>
       </w:r>
       <w:r>
@@ -342,7 +283,7 @@
     </w:p>
     <w:p>
       <w:pPr>
-        <w:pStyle w:val="Akapitzlist"/>
+        <w:pStyle w:val="ListParagraph"/>
         <w:numPr>
           <w:ilvl w:val="0"/>
           <w:numId w:val="1"/>
@@ -399,11 +340,19 @@
         <w:t xml:space="preserve"> wina (osobno dla wina białego i czerwonego).</w:t>
       </w:r>
       <w:r>
-        <w:t xml:space="preserve"> T</w:t>
-      </w:r>
-      <w:r>
-        <w:t>en nowy przepis "podajemy" naszemu najlepszemu modelowi (z Eksperymentu 1) i sprawdzamy, jaką ocenę mu wystawi. Eksperyment ma dowieść, czy algorytm wyszkolony na prawdziwych winach rozpozna w tej uśrednionej kompozycji produkt najwyższej jakości.</w:t>
-      </w:r>
+        <w:t xml:space="preserve"> </w:t>
+      </w:r>
+      <w:r>
+        <w:t>Wyznaczony w ten sposób przepis zostanie poddany analizie za pomocą modelu wyłonion w eksperymencie 1, by zobaczyć</w:t>
+      </w:r>
+      <w:r>
+        <w:t xml:space="preserve">, jak zostanie oceniony. </w:t>
+      </w:r>
+    </w:p>
+    <w:p>
+      <w:pPr>
+        <w:jc w:val="both"/>
+      </w:pPr>
     </w:p>
     <w:sectPr>
       <w:pgSz w:w="11906" w:h="16838"/>
@@ -909,15 +858,15 @@
     <w:lsdException w:name="Unresolved Mention" w:semiHidden="1" w:unhideWhenUsed="1"/>
     <w:lsdException w:name="Smart Link" w:semiHidden="1" w:unhideWhenUsed="1"/>
   </w:latentStyles>
-  <w:style w:type="paragraph" w:default="1" w:styleId="Normalny">
+  <w:style w:type="paragraph" w:default="1" w:styleId="Normal">
     <w:name w:val="Normal"/>
     <w:qFormat/>
   </w:style>
-  <w:style w:type="paragraph" w:styleId="Nagwek1">
+  <w:style w:type="paragraph" w:styleId="Heading1">
     <w:name w:val="heading 1"/>
-    <w:basedOn w:val="Normalny"/>
-    <w:next w:val="Normalny"/>
-    <w:link w:val="Nagwek1Znak"/>
+    <w:basedOn w:val="Normal"/>
+    <w:next w:val="Normal"/>
+    <w:link w:val="Heading1Char"/>
     <w:uiPriority w:val="9"/>
     <w:qFormat/>
     <w:rsid w:val="00894E0C"/>
@@ -934,11 +883,11 @@
       <w:szCs w:val="40"/>
     </w:rPr>
   </w:style>
-  <w:style w:type="paragraph" w:styleId="Nagwek2">
+  <w:style w:type="paragraph" w:styleId="Heading2">
     <w:name w:val="heading 2"/>
-    <w:basedOn w:val="Normalny"/>
-    <w:next w:val="Normalny"/>
-    <w:link w:val="Nagwek2Znak"/>
+    <w:basedOn w:val="Normal"/>
+    <w:next w:val="Normal"/>
+    <w:link w:val="Heading2Char"/>
     <w:uiPriority w:val="9"/>
     <w:semiHidden/>
     <w:unhideWhenUsed/>
@@ -957,11 +906,11 @@
       <w:szCs w:val="32"/>
     </w:rPr>
   </w:style>
-  <w:style w:type="paragraph" w:styleId="Nagwek3">
+  <w:style w:type="paragraph" w:styleId="Heading3">
     <w:name w:val="heading 3"/>
-    <w:basedOn w:val="Normalny"/>
-    <w:next w:val="Normalny"/>
-    <w:link w:val="Nagwek3Znak"/>
+    <w:basedOn w:val="Normal"/>
+    <w:next w:val="Normal"/>
+    <w:link w:val="Heading3Char"/>
     <w:uiPriority w:val="9"/>
     <w:semiHidden/>
     <w:unhideWhenUsed/>
@@ -980,11 +929,11 @@
       <w:szCs w:val="28"/>
     </w:rPr>
   </w:style>
-  <w:style w:type="paragraph" w:styleId="Nagwek4">
+  <w:style w:type="paragraph" w:styleId="Heading4">
     <w:name w:val="heading 4"/>
-    <w:basedOn w:val="Normalny"/>
-    <w:next w:val="Normalny"/>
-    <w:link w:val="Nagwek4Znak"/>
+    <w:basedOn w:val="Normal"/>
+    <w:next w:val="Normal"/>
+    <w:link w:val="Heading4Char"/>
     <w:uiPriority w:val="9"/>
     <w:semiHidden/>
     <w:unhideWhenUsed/>
@@ -1003,11 +952,11 @@
       <w:color w:val="0F4761" w:themeColor="accent1" w:themeShade="BF"/>
     </w:rPr>
   </w:style>
-  <w:style w:type="paragraph" w:styleId="Nagwek5">
+  <w:style w:type="paragraph" w:styleId="Heading5">
     <w:name w:val="heading 5"/>
-    <w:basedOn w:val="Normalny"/>
-    <w:next w:val="Normalny"/>
-    <w:link w:val="Nagwek5Znak"/>
+    <w:basedOn w:val="Normal"/>
+    <w:next w:val="Normal"/>
+    <w:link w:val="Heading5Char"/>
     <w:uiPriority w:val="9"/>
     <w:semiHidden/>
     <w:unhideWhenUsed/>
@@ -1024,11 +973,11 @@
       <w:color w:val="0F4761" w:themeColor="accent1" w:themeShade="BF"/>
     </w:rPr>
   </w:style>
-  <w:style w:type="paragraph" w:styleId="Nagwek6">
+  <w:style w:type="paragraph" w:styleId="Heading6">
     <w:name w:val="heading 6"/>
-    <w:basedOn w:val="Normalny"/>
-    <w:next w:val="Normalny"/>
-    <w:link w:val="Nagwek6Znak"/>
+    <w:basedOn w:val="Normal"/>
+    <w:next w:val="Normal"/>
+    <w:link w:val="Heading6Char"/>
     <w:uiPriority w:val="9"/>
     <w:semiHidden/>
     <w:unhideWhenUsed/>
@@ -1047,11 +996,11 @@
       <w:color w:val="595959" w:themeColor="text1" w:themeTint="A6"/>
     </w:rPr>
   </w:style>
-  <w:style w:type="paragraph" w:styleId="Nagwek7">
+  <w:style w:type="paragraph" w:styleId="Heading7">
     <w:name w:val="heading 7"/>
-    <w:basedOn w:val="Normalny"/>
-    <w:next w:val="Normalny"/>
-    <w:link w:val="Nagwek7Znak"/>
+    <w:basedOn w:val="Normal"/>
+    <w:next w:val="Normal"/>
+    <w:link w:val="Heading7Char"/>
     <w:uiPriority w:val="9"/>
     <w:semiHidden/>
     <w:unhideWhenUsed/>
@@ -1068,11 +1017,11 @@
       <w:color w:val="595959" w:themeColor="text1" w:themeTint="A6"/>
     </w:rPr>
   </w:style>
-  <w:style w:type="paragraph" w:styleId="Nagwek8">
+  <w:style w:type="paragraph" w:styleId="Heading8">
     <w:name w:val="heading 8"/>
-    <w:basedOn w:val="Normalny"/>
-    <w:next w:val="Normalny"/>
-    <w:link w:val="Nagwek8Znak"/>
+    <w:basedOn w:val="Normal"/>
+    <w:next w:val="Normal"/>
+    <w:link w:val="Heading8Char"/>
     <w:uiPriority w:val="9"/>
     <w:semiHidden/>
     <w:unhideWhenUsed/>
@@ -1091,11 +1040,11 @@
       <w:color w:val="272727" w:themeColor="text1" w:themeTint="D8"/>
     </w:rPr>
   </w:style>
-  <w:style w:type="paragraph" w:styleId="Nagwek9">
+  <w:style w:type="paragraph" w:styleId="Heading9">
     <w:name w:val="heading 9"/>
-    <w:basedOn w:val="Normalny"/>
-    <w:next w:val="Normalny"/>
-    <w:link w:val="Nagwek9Znak"/>
+    <w:basedOn w:val="Normal"/>
+    <w:next w:val="Normal"/>
+    <w:link w:val="Heading9Char"/>
     <w:uiPriority w:val="9"/>
     <w:semiHidden/>
     <w:unhideWhenUsed/>
@@ -1112,12 +1061,13 @@
       <w:color w:val="272727" w:themeColor="text1" w:themeTint="D8"/>
     </w:rPr>
   </w:style>
-  <w:style w:type="character" w:default="1" w:styleId="Domylnaczcionkaakapitu">
+  <w:style w:type="character" w:default="1" w:styleId="DefaultParagraphFont">
     <w:name w:val="Default Paragraph Font"/>
     <w:uiPriority w:val="1"/>
+    <w:semiHidden/>
     <w:unhideWhenUsed/>
   </w:style>
-  <w:style w:type="table" w:default="1" w:styleId="Standardowy">
+  <w:style w:type="table" w:default="1" w:styleId="TableNormal">
     <w:name w:val="Normal Table"/>
     <w:uiPriority w:val="99"/>
     <w:semiHidden/>
@@ -1132,16 +1082,16 @@
       </w:tblCellMar>
     </w:tblPr>
   </w:style>
-  <w:style w:type="numbering" w:default="1" w:styleId="Bezlisty">
+  <w:style w:type="numbering" w:default="1" w:styleId="NoList">
     <w:name w:val="No List"/>
     <w:uiPriority w:val="99"/>
     <w:semiHidden/>
     <w:unhideWhenUsed/>
   </w:style>
-  <w:style w:type="character" w:customStyle="1" w:styleId="Nagwek1Znak">
-    <w:name w:val="Nagłówek 1 Znak"/>
-    <w:basedOn w:val="Domylnaczcionkaakapitu"/>
-    <w:link w:val="Nagwek1"/>
+  <w:style w:type="character" w:customStyle="1" w:styleId="Heading1Char">
+    <w:name w:val="Heading 1 Char"/>
+    <w:basedOn w:val="DefaultParagraphFont"/>
+    <w:link w:val="Heading1"/>
     <w:uiPriority w:val="9"/>
     <w:rsid w:val="00894E0C"/>
     <w:rPr>
@@ -1151,10 +1101,10 @@
       <w:szCs w:val="40"/>
     </w:rPr>
   </w:style>
-  <w:style w:type="character" w:customStyle="1" w:styleId="Nagwek2Znak">
-    <w:name w:val="Nagłówek 2 Znak"/>
-    <w:basedOn w:val="Domylnaczcionkaakapitu"/>
-    <w:link w:val="Nagwek2"/>
+  <w:style w:type="character" w:customStyle="1" w:styleId="Heading2Char">
+    <w:name w:val="Heading 2 Char"/>
+    <w:basedOn w:val="DefaultParagraphFont"/>
+    <w:link w:val="Heading2"/>
     <w:uiPriority w:val="9"/>
     <w:semiHidden/>
     <w:rsid w:val="00894E0C"/>
@@ -1165,10 +1115,10 @@
       <w:szCs w:val="32"/>
     </w:rPr>
   </w:style>
-  <w:style w:type="character" w:customStyle="1" w:styleId="Nagwek3Znak">
-    <w:name w:val="Nagłówek 3 Znak"/>
-    <w:basedOn w:val="Domylnaczcionkaakapitu"/>
-    <w:link w:val="Nagwek3"/>
+  <w:style w:type="character" w:customStyle="1" w:styleId="Heading3Char">
+    <w:name w:val="Heading 3 Char"/>
+    <w:basedOn w:val="DefaultParagraphFont"/>
+    <w:link w:val="Heading3"/>
     <w:uiPriority w:val="9"/>
     <w:semiHidden/>
     <w:rsid w:val="00894E0C"/>
@@ -1179,10 +1129,10 @@
       <w:szCs w:val="28"/>
     </w:rPr>
   </w:style>
-  <w:style w:type="character" w:customStyle="1" w:styleId="Nagwek4Znak">
-    <w:name w:val="Nagłówek 4 Znak"/>
-    <w:basedOn w:val="Domylnaczcionkaakapitu"/>
-    <w:link w:val="Nagwek4"/>
+  <w:style w:type="character" w:customStyle="1" w:styleId="Heading4Char">
+    <w:name w:val="Heading 4 Char"/>
+    <w:basedOn w:val="DefaultParagraphFont"/>
+    <w:link w:val="Heading4"/>
     <w:uiPriority w:val="9"/>
     <w:semiHidden/>
     <w:rsid w:val="00894E0C"/>
@@ -1193,10 +1143,10 @@
       <w:color w:val="0F4761" w:themeColor="accent1" w:themeShade="BF"/>
     </w:rPr>
   </w:style>
-  <w:style w:type="character" w:customStyle="1" w:styleId="Nagwek5Znak">
-    <w:name w:val="Nagłówek 5 Znak"/>
-    <w:basedOn w:val="Domylnaczcionkaakapitu"/>
-    <w:link w:val="Nagwek5"/>
+  <w:style w:type="character" w:customStyle="1" w:styleId="Heading5Char">
+    <w:name w:val="Heading 5 Char"/>
+    <w:basedOn w:val="DefaultParagraphFont"/>
+    <w:link w:val="Heading5"/>
     <w:uiPriority w:val="9"/>
     <w:semiHidden/>
     <w:rsid w:val="00894E0C"/>
@@ -1205,10 +1155,10 @@
       <w:color w:val="0F4761" w:themeColor="accent1" w:themeShade="BF"/>
     </w:rPr>
   </w:style>
-  <w:style w:type="character" w:customStyle="1" w:styleId="Nagwek6Znak">
-    <w:name w:val="Nagłówek 6 Znak"/>
-    <w:basedOn w:val="Domylnaczcionkaakapitu"/>
-    <w:link w:val="Nagwek6"/>
+  <w:style w:type="character" w:customStyle="1" w:styleId="Heading6Char">
+    <w:name w:val="Heading 6 Char"/>
+    <w:basedOn w:val="DefaultParagraphFont"/>
+    <w:link w:val="Heading6"/>
     <w:uiPriority w:val="9"/>
     <w:semiHidden/>
     <w:rsid w:val="00894E0C"/>
@@ -1219,10 +1169,10 @@
       <w:color w:val="595959" w:themeColor="text1" w:themeTint="A6"/>
     </w:rPr>
   </w:style>
-  <w:style w:type="character" w:customStyle="1" w:styleId="Nagwek7Znak">
-    <w:name w:val="Nagłówek 7 Znak"/>
-    <w:basedOn w:val="Domylnaczcionkaakapitu"/>
-    <w:link w:val="Nagwek7"/>
+  <w:style w:type="character" w:customStyle="1" w:styleId="Heading7Char">
+    <w:name w:val="Heading 7 Char"/>
+    <w:basedOn w:val="DefaultParagraphFont"/>
+    <w:link w:val="Heading7"/>
     <w:uiPriority w:val="9"/>
     <w:semiHidden/>
     <w:rsid w:val="00894E0C"/>
@@ -1231,10 +1181,10 @@
       <w:color w:val="595959" w:themeColor="text1" w:themeTint="A6"/>
     </w:rPr>
   </w:style>
-  <w:style w:type="character" w:customStyle="1" w:styleId="Nagwek8Znak">
-    <w:name w:val="Nagłówek 8 Znak"/>
-    <w:basedOn w:val="Domylnaczcionkaakapitu"/>
-    <w:link w:val="Nagwek8"/>
+  <w:style w:type="character" w:customStyle="1" w:styleId="Heading8Char">
+    <w:name w:val="Heading 8 Char"/>
+    <w:basedOn w:val="DefaultParagraphFont"/>
+    <w:link w:val="Heading8"/>
     <w:uiPriority w:val="9"/>
     <w:semiHidden/>
     <w:rsid w:val="00894E0C"/>
@@ -1245,10 +1195,10 @@
       <w:color w:val="272727" w:themeColor="text1" w:themeTint="D8"/>
     </w:rPr>
   </w:style>
-  <w:style w:type="character" w:customStyle="1" w:styleId="Nagwek9Znak">
-    <w:name w:val="Nagłówek 9 Znak"/>
-    <w:basedOn w:val="Domylnaczcionkaakapitu"/>
-    <w:link w:val="Nagwek9"/>
+  <w:style w:type="character" w:customStyle="1" w:styleId="Heading9Char">
+    <w:name w:val="Heading 9 Char"/>
+    <w:basedOn w:val="DefaultParagraphFont"/>
+    <w:link w:val="Heading9"/>
     <w:uiPriority w:val="9"/>
     <w:semiHidden/>
     <w:rsid w:val="00894E0C"/>
@@ -1257,11 +1207,11 @@
       <w:color w:val="272727" w:themeColor="text1" w:themeTint="D8"/>
     </w:rPr>
   </w:style>
-  <w:style w:type="paragraph" w:styleId="Tytu">
+  <w:style w:type="paragraph" w:styleId="Title">
     <w:name w:val="Title"/>
-    <w:basedOn w:val="Normalny"/>
-    <w:next w:val="Normalny"/>
-    <w:link w:val="TytuZnak"/>
+    <w:basedOn w:val="Normal"/>
+    <w:next w:val="Normal"/>
+    <w:link w:val="TitleChar"/>
     <w:uiPriority w:val="10"/>
     <w:qFormat/>
     <w:rsid w:val="00894E0C"/>
@@ -1277,10 +1227,10 @@
       <w:szCs w:val="56"/>
     </w:rPr>
   </w:style>
-  <w:style w:type="character" w:customStyle="1" w:styleId="TytuZnak">
-    <w:name w:val="Tytuł Znak"/>
-    <w:basedOn w:val="Domylnaczcionkaakapitu"/>
-    <w:link w:val="Tytu"/>
+  <w:style w:type="character" w:customStyle="1" w:styleId="TitleChar">
+    <w:name w:val="Title Char"/>
+    <w:basedOn w:val="DefaultParagraphFont"/>
+    <w:link w:val="Title"/>
     <w:uiPriority w:val="10"/>
     <w:rsid w:val="00894E0C"/>
     <w:rPr>
@@ -1291,11 +1241,11 @@
       <w:szCs w:val="56"/>
     </w:rPr>
   </w:style>
-  <w:style w:type="paragraph" w:styleId="Podtytu">
+  <w:style w:type="paragraph" w:styleId="Subtitle">
     <w:name w:val="Subtitle"/>
-    <w:basedOn w:val="Normalny"/>
-    <w:next w:val="Normalny"/>
-    <w:link w:val="PodtytuZnak"/>
+    <w:basedOn w:val="Normal"/>
+    <w:next w:val="Normal"/>
+    <w:link w:val="SubtitleChar"/>
     <w:uiPriority w:val="11"/>
     <w:qFormat/>
     <w:rsid w:val="00894E0C"/>
@@ -1312,10 +1262,10 @@
       <w:szCs w:val="28"/>
     </w:rPr>
   </w:style>
-  <w:style w:type="character" w:customStyle="1" w:styleId="PodtytuZnak">
-    <w:name w:val="Podtytuł Znak"/>
-    <w:basedOn w:val="Domylnaczcionkaakapitu"/>
-    <w:link w:val="Podtytu"/>
+  <w:style w:type="character" w:customStyle="1" w:styleId="SubtitleChar">
+    <w:name w:val="Subtitle Char"/>
+    <w:basedOn w:val="DefaultParagraphFont"/>
+    <w:link w:val="Subtitle"/>
     <w:uiPriority w:val="11"/>
     <w:rsid w:val="00894E0C"/>
     <w:rPr>
@@ -1326,11 +1276,11 @@
       <w:szCs w:val="28"/>
     </w:rPr>
   </w:style>
-  <w:style w:type="paragraph" w:styleId="Cytat">
+  <w:style w:type="paragraph" w:styleId="Quote">
     <w:name w:val="Quote"/>
-    <w:basedOn w:val="Normalny"/>
-    <w:next w:val="Normalny"/>
-    <w:link w:val="CytatZnak"/>
+    <w:basedOn w:val="Normal"/>
+    <w:next w:val="Normal"/>
+    <w:link w:val="QuoteChar"/>
     <w:uiPriority w:val="29"/>
     <w:qFormat/>
     <w:rsid w:val="00894E0C"/>
@@ -1344,10 +1294,10 @@
       <w:color w:val="404040" w:themeColor="text1" w:themeTint="BF"/>
     </w:rPr>
   </w:style>
-  <w:style w:type="character" w:customStyle="1" w:styleId="CytatZnak">
-    <w:name w:val="Cytat Znak"/>
-    <w:basedOn w:val="Domylnaczcionkaakapitu"/>
-    <w:link w:val="Cytat"/>
+  <w:style w:type="character" w:customStyle="1" w:styleId="QuoteChar">
+    <w:name w:val="Quote Char"/>
+    <w:basedOn w:val="DefaultParagraphFont"/>
+    <w:link w:val="Quote"/>
     <w:uiPriority w:val="29"/>
     <w:rsid w:val="00894E0C"/>
     <w:rPr>
@@ -1356,9 +1306,9 @@
       <w:color w:val="404040" w:themeColor="text1" w:themeTint="BF"/>
     </w:rPr>
   </w:style>
-  <w:style w:type="paragraph" w:styleId="Akapitzlist">
+  <w:style w:type="paragraph" w:styleId="ListParagraph">
     <w:name w:val="List Paragraph"/>
-    <w:basedOn w:val="Normalny"/>
+    <w:basedOn w:val="Normal"/>
     <w:uiPriority w:val="34"/>
     <w:qFormat/>
     <w:rsid w:val="00894E0C"/>
@@ -1367,9 +1317,9 @@
       <w:contextualSpacing/>
     </w:pPr>
   </w:style>
-  <w:style w:type="character" w:styleId="Wyrnienieintensywne">
+  <w:style w:type="character" w:styleId="IntenseEmphasis">
     <w:name w:val="Intense Emphasis"/>
-    <w:basedOn w:val="Domylnaczcionkaakapitu"/>
+    <w:basedOn w:val="DefaultParagraphFont"/>
     <w:uiPriority w:val="21"/>
     <w:qFormat/>
     <w:rsid w:val="00894E0C"/>
@@ -1379,11 +1329,11 @@
       <w:color w:val="0F4761" w:themeColor="accent1" w:themeShade="BF"/>
     </w:rPr>
   </w:style>
-  <w:style w:type="paragraph" w:styleId="Cytatintensywny">
+  <w:style w:type="paragraph" w:styleId="IntenseQuote">
     <w:name w:val="Intense Quote"/>
-    <w:basedOn w:val="Normalny"/>
-    <w:next w:val="Normalny"/>
-    <w:link w:val="CytatintensywnyZnak"/>
+    <w:basedOn w:val="Normal"/>
+    <w:next w:val="Normal"/>
+    <w:link w:val="IntenseQuoteChar"/>
     <w:uiPriority w:val="30"/>
     <w:qFormat/>
     <w:rsid w:val="00894E0C"/>
@@ -1402,10 +1352,10 @@
       <w:color w:val="0F4761" w:themeColor="accent1" w:themeShade="BF"/>
     </w:rPr>
   </w:style>
-  <w:style w:type="character" w:customStyle="1" w:styleId="CytatintensywnyZnak">
-    <w:name w:val="Cytat intensywny Znak"/>
-    <w:basedOn w:val="Domylnaczcionkaakapitu"/>
-    <w:link w:val="Cytatintensywny"/>
+  <w:style w:type="character" w:customStyle="1" w:styleId="IntenseQuoteChar">
+    <w:name w:val="Intense Quote Char"/>
+    <w:basedOn w:val="DefaultParagraphFont"/>
+    <w:link w:val="IntenseQuote"/>
     <w:uiPriority w:val="30"/>
     <w:rsid w:val="00894E0C"/>
     <w:rPr>
@@ -1414,9 +1364,9 @@
       <w:color w:val="0F4761" w:themeColor="accent1" w:themeShade="BF"/>
     </w:rPr>
   </w:style>
-  <w:style w:type="character" w:styleId="Odwoanieintensywne">
+  <w:style w:type="character" w:styleId="IntenseReference">
     <w:name w:val="Intense Reference"/>
-    <w:basedOn w:val="Domylnaczcionkaakapitu"/>
+    <w:basedOn w:val="DefaultParagraphFont"/>
     <w:uiPriority w:val="32"/>
     <w:qFormat/>
     <w:rsid w:val="00894E0C"/>

</xml_diff>